<commit_message>
Add in-app Help & Documents; refresh docs and release build
The User Guide, Setup & Administration Guide and Release Notes are now
embedded in the app (Help & Documents screen) with PDF and Word downloads,
so one shared link or file carries the complete application.
Help screen hides the scan toolbar (found by checking the live hosted app).
97 tests: 42 unit, 47 UI scenario, 8 Playwright E2E.

Co-Authored-By: Claude Opus 5.5 <noreply@anthropic.com>
Claude-Session: https://claude.ai/code/session_01QfiqXwchet7ZW5QeCH3Hw6
</commit_message>
<xml_diff>
--- a/docs/Inventory Analyzer - Release Notes.docx
+++ b/docs/Inventory Analyzer - Release Notes.docx
@@ -24,7 +24,7 @@
         <w:pStyle w:val="BodyText"/>
       </w:pPr>
       <w:r>
-        <w:t xml:space="preserve">Inventory Analyzer is a browser app that inventories any folder you choose, analyzes storage, and exports Excel and CSV reports. It runs locally and uploads nothing. The current release, v1.2, passes all 92 automated tests.</w:t>
+        <w:t xml:space="preserve">Inventory Analyzer is a browser app that inventories any folder you choose, analyzes storage, and exports Excel and CSV reports. It runs locally and uploads nothing. The current release, v1.2, passes all 97 automated tests.</w:t>
       </w:r>
     </w:p>
     <w:bookmarkStart w:id="20" w:name="whats-new-in-v12-24-oct-2026"/>
@@ -41,7 +41,7 @@
         <w:pStyle w:val="FirstParagraph"/>
       </w:pPr>
       <w:r>
-        <w:t xml:space="preserve">v1.2 lets you go back to an earlier scan and download its reports, even after closing the app. All 92 automated tests pass, up from 81.</w:t>
+        <w:t xml:space="preserve">v1.2 lets you go back to an earlier scan and download its reports, even after closing the app, and carries its own guides. All 97 automated tests pass, up from 81.</w:t>
       </w:r>
     </w:p>
     <w:tbl>
@@ -412,6 +412,62 @@
                 <w:sz w:val="19"/>
               </w:rPr>
               <w:t xml:space="preserve">Settings</w:t>
+            </w:r>
+          </w:p>
+        </w:tc>
+      </w:tr>
+      <w:tr>
+        <w:tc>
+          <w:tcPr>
+            <w:tcMar>
+              <w:top w:w="70" w:type="dxa"/>
+              <w:bottom w:w="70" w:type="dxa"/>
+              <w:left w:w="100" w:type="dxa"/>
+              <w:right w:w="100" w:type="dxa"/>
+            </w:tcMar>
+          </w:tcPr>
+          <w:p>
+            <w:pPr>
+              <w:pStyle w:val="Compact"/>
+              <w:spacing w:after="0" w:before="0"/>
+              <w:jc w:val="left"/>
+            </w:pPr>
+            <w:r>
+              <w:rPr>
+                <w:bCs/>
+                <w:b/>
+                <w:sz w:val="19"/>
+              </w:rPr>
+              <w:t xml:space="preserve">Help &amp; Documents</w:t>
+            </w:r>
+            <w:r>
+              <w:rPr>
+                <w:sz w:val="19"/>
+              </w:rPr>
+              <w:t xml:space="preserve">: User Guide, Setup &amp; Administration Guide and Release Notes inside the app, each downloadable as PDF or Word</w:t>
+            </w:r>
+          </w:p>
+        </w:tc>
+        <w:tc>
+          <w:tcPr>
+            <w:tcMar>
+              <w:top w:w="70" w:type="dxa"/>
+              <w:bottom w:w="70" w:type="dxa"/>
+              <w:left w:w="100" w:type="dxa"/>
+              <w:right w:w="100" w:type="dxa"/>
+            </w:tcMar>
+          </w:tcPr>
+          <w:p>
+            <w:pPr>
+              <w:pStyle w:val="Compact"/>
+              <w:spacing w:after="0" w:before="0"/>
+              <w:jc w:val="left"/>
+            </w:pPr>
+            <w:r>
+              <w:rPr>
+                <w:sz w:val="19"/>
+              </w:rPr>
+              <w:t xml:space="preserve">New menu item</w:t>
             </w:r>
           </w:p>
         </w:tc>

</xml_diff>